<commit_message>
chore: refresh news data
</commit_message>
<xml_diff>
--- a/data/reports/daily-documents/latest/previous_daily_report.docx
+++ b/data/reports/daily-documents/latest/previous_daily_report.docx
@@ -26,7 +26,7 @@
           <w:rFonts w:ascii="Kaiti SC" w:hAnsi="Kaiti SC" w:eastAsia="Kaiti SC" w:cs="Kaiti SC"/>
           <w:sz w:val="21"/>
         </w:rPr>
-        <w:t>2026-10-09（上一自然日）</w:t>
+        <w:t>2026-10-10（上一自然日）</w:t>
       </w:r>
     </w:p>
     <w:tbl>
@@ -81,7 +81,7 @@
                 <w:b w:val="0"/>
                 <w:sz w:val="19"/>
               </w:rPr>
-              <w:t>2026-10-09</w:t>
+              <w:t>2026-10-10</w:t>
             </w:r>
           </w:p>
         </w:tc>
@@ -127,7 +127,7 @@
                 <w:b w:val="0"/>
                 <w:sz w:val="19"/>
               </w:rPr>
-              <w:t>42 条 / 4 家</w:t>
+              <w:t>19 条 / 3 家</w:t>
             </w:r>
           </w:p>
         </w:tc>
@@ -173,7 +173,7 @@
                 <w:b w:val="0"/>
                 <w:sz w:val="19"/>
               </w:rPr>
-              <w:t>17 个</w:t>
+              <w:t>10 个</w:t>
             </w:r>
           </w:p>
         </w:tc>
@@ -219,7 +219,7 @@
                 <w:b w:val="0"/>
                 <w:sz w:val="19"/>
               </w:rPr>
-              <w:t>2026-10-10</w:t>
+              <w:t>2026-10-11</w:t>
             </w:r>
           </w:p>
         </w:tc>
@@ -245,7 +245,7 @@
     </w:p>
     <w:p>
       <w:r>
-        <w:t>2026-10-09 共归档 42 条新闻，覆盖 4 家公司、17 个信息来源。 新闻量较多的公司包括 SpaceX、Blue Origin、微纳星空、银河航天。</w:t>
+        <w:t>2026-10-10 共归档 19 条新闻，覆盖 3 家公司、10 个信息来源。 新闻量较多的公司包括 SpaceX、Blue Origin、微纳星空。</w:t>
       </w:r>
     </w:p>
     <w:p>
@@ -279,7 +279,7 @@
           <w:rFonts w:ascii="Kaiti SC" w:hAnsi="Kaiti SC" w:eastAsia="Kaiti SC" w:cs="Kaiti SC"/>
           <w:sz w:val="21"/>
         </w:rPr>
-        <w:t>【市场与股价】Blue Origin：Blue Origin expands in Texas as its founder contemplates an IPO - SpaceNews （SpaceNews）</w:t>
+        <w:t>【发射与任务】SpaceX：SpaceX to make another attempt to launch 21 data satellites for Space Development Agency （Spaceflight Now）</w:t>
       </w:r>
     </w:p>
     <w:p>
@@ -300,7 +300,7 @@
           <w:rFonts w:ascii="Kaiti SC" w:hAnsi="Kaiti SC" w:eastAsia="Kaiti SC" w:cs="Kaiti SC"/>
           <w:sz w:val="21"/>
         </w:rPr>
-        <w:t>【市场与股价】Blue Origin：Blue Origin's potential IPO signals the countdown to a new phase of the space race - AOL.com （AOL.com）</w:t>
+        <w:t>【市场与股价】Blue Origin：Blue Origin Commits $550M to Texas Satellite Complex as Jeff Bezos Confirms $10B Equity Round and IPO Roadmap （satnews.com）</w:t>
       </w:r>
     </w:p>
     <w:p>
@@ -321,7 +321,7 @@
           <w:rFonts w:ascii="Kaiti SC" w:hAnsi="Kaiti SC" w:eastAsia="Kaiti SC" w:cs="Kaiti SC"/>
           <w:sz w:val="21"/>
         </w:rPr>
-        <w:t>【市场与股价】Blue Origin：Blue Origin IPO could come in next few years, Jeff Bezos says in wake of rocket disaster - New York Post （New York Post）</w:t>
+        <w:t>【发射与任务】SpaceX：SpaceX launches 21 data satellites for the Space Development Agency - Spaceflight Now （Spaceflight Now）</w:t>
       </w:r>
     </w:p>
     <w:p>
@@ -342,7 +342,7 @@
           <w:rFonts w:ascii="Kaiti SC" w:hAnsi="Kaiti SC" w:eastAsia="Kaiti SC" w:cs="Kaiti SC"/>
           <w:sz w:val="21"/>
         </w:rPr>
-        <w:t>【发射与任务】SpaceX：SpaceX eyes 2 rocket launches in 3 days in California after scrubs - Ventura County Star （Ventura County Star）</w:t>
+        <w:t>【发射与任务】SpaceX：SpaceX launches 21 satellites to orbit for the US military after 5-day delay (video) - Space （Space）</w:t>
       </w:r>
     </w:p>
     <w:p>
@@ -363,7 +363,7 @@
           <w:rFonts w:ascii="Kaiti SC" w:hAnsi="Kaiti SC" w:eastAsia="Kaiti SC" w:cs="Kaiti SC"/>
           <w:sz w:val="21"/>
         </w:rPr>
-        <w:t>【发射与任务】SpaceX：SpaceX could be planning near double-header rocket launch in 3 days - azcentral.com and The Arizona Republic （azcentral.com and The Arizona Republic）</w:t>
+        <w:t>【发射与任务】SpaceX：SpaceX 9 deploys 21 satellites for US military in fourth SDA Tranche 1 mission （bing.com）</w:t>
       </w:r>
     </w:p>
     <w:p>
@@ -384,7 +384,7 @@
           <w:rFonts w:ascii="Kaiti SC" w:hAnsi="Kaiti SC" w:eastAsia="Kaiti SC" w:cs="Kaiti SC"/>
           <w:sz w:val="21"/>
         </w:rPr>
-        <w:t>【发射与任务】SpaceX：Rocket Report: A rare Falcon 9 scrub; is it just about Vulcan's time to shine? （arstechnica.com）</w:t>
+        <w:t>【发射与任务】SpaceX：SpaceX Falcon 9 launches 21 military satellites into orbit （bing.com）</w:t>
       </w:r>
     </w:p>
     <w:p>
@@ -405,112 +405,7 @@
           <w:rFonts w:ascii="Kaiti SC" w:hAnsi="Kaiti SC" w:eastAsia="Kaiti SC" w:cs="Kaiti SC"/>
           <w:sz w:val="21"/>
         </w:rPr>
-        <w:t>【监管与政策】SpaceX：SpaceX says Starlink will "become a major mobile carrier in the U.S." （bing.com）</w:t>
-      </w:r>
-    </w:p>
-    <w:p>
-      <w:pPr>
-        <w:keepLines/>
-        <w:spacing w:after="60"/>
-        <w:ind w:left="369" w:hanging="227"/>
-      </w:pPr>
-      <w:r>
-        <w:rPr>
-          <w:rFonts w:ascii="Kaiti SC" w:hAnsi="Kaiti SC" w:eastAsia="Kaiti SC" w:cs="Kaiti SC"/>
-          <w:sz w:val="21"/>
-        </w:rPr>
-        <w:t xml:space="preserve">➢ </w:t>
-      </w:r>
-      <w:r>
-        <w:rPr>
-          <w:rFonts w:ascii="Kaiti SC" w:hAnsi="Kaiti SC" w:eastAsia="Kaiti SC" w:cs="Kaiti SC"/>
-          <w:sz w:val="21"/>
-        </w:rPr>
-        <w:t>【监管与政策】SpaceX：SpaceX says Starlink will "become a major mobile carrier in the U.S." （bing.com）</w:t>
-      </w:r>
-    </w:p>
-    <w:p>
-      <w:pPr>
-        <w:keepLines/>
-        <w:spacing w:after="60"/>
-        <w:ind w:left="369" w:hanging="227"/>
-      </w:pPr>
-      <w:r>
-        <w:rPr>
-          <w:rFonts w:ascii="Kaiti SC" w:hAnsi="Kaiti SC" w:eastAsia="Kaiti SC" w:cs="Kaiti SC"/>
-          <w:sz w:val="21"/>
-        </w:rPr>
-        <w:t xml:space="preserve">➢ </w:t>
-      </w:r>
-      <w:r>
-        <w:rPr>
-          <w:rFonts w:ascii="Kaiti SC" w:hAnsi="Kaiti SC" w:eastAsia="Kaiti SC" w:cs="Kaiti SC"/>
-          <w:sz w:val="21"/>
-        </w:rPr>
-        <w:t>【发射与任务】Blue Origin：Blue Origin confirms 2026 launch - Advanced Television （Advanced Television）</w:t>
-      </w:r>
-    </w:p>
-    <w:p>
-      <w:pPr>
-        <w:keepLines/>
-        <w:spacing w:after="60"/>
-        <w:ind w:left="369" w:hanging="227"/>
-      </w:pPr>
-      <w:r>
-        <w:rPr>
-          <w:rFonts w:ascii="Kaiti SC" w:hAnsi="Kaiti SC" w:eastAsia="Kaiti SC" w:cs="Kaiti SC"/>
-          <w:sz w:val="21"/>
-        </w:rPr>
-        <w:t xml:space="preserve">➢ </w:t>
-      </w:r>
-      <w:r>
-        <w:rPr>
-          <w:rFonts w:ascii="Kaiti SC" w:hAnsi="Kaiti SC" w:eastAsia="Kaiti SC" w:cs="Kaiti SC"/>
-          <w:sz w:val="21"/>
-        </w:rPr>
-        <w:t>【产品与技术】Blue Origin：Blue Origin plans $555 million satellite factory in Hutto, Texas （bing.com）</w:t>
-      </w:r>
-    </w:p>
-    <w:p>
-      <w:pPr>
-        <w:keepLines/>
-        <w:spacing w:after="60"/>
-        <w:ind w:left="369" w:hanging="227"/>
-      </w:pPr>
-      <w:r>
-        <w:rPr>
-          <w:rFonts w:ascii="Kaiti SC" w:hAnsi="Kaiti SC" w:eastAsia="Kaiti SC" w:cs="Kaiti SC"/>
-          <w:sz w:val="21"/>
-        </w:rPr>
-        <w:t xml:space="preserve">➢ </w:t>
-      </w:r>
-      <w:r>
-        <w:rPr>
-          <w:rFonts w:ascii="Kaiti SC" w:hAnsi="Kaiti SC" w:eastAsia="Kaiti SC" w:cs="Kaiti SC"/>
-          <w:sz w:val="21"/>
-        </w:rPr>
-        <w:t>【市场与股价】银河航天：银河航天（北京）科技集团股份有限公司启动上市辅导 - Jiemian.com （Jiemian.com）</w:t>
-      </w:r>
-    </w:p>
-    <w:p>
-      <w:pPr>
-        <w:keepLines/>
-        <w:spacing w:after="60"/>
-        <w:ind w:left="369" w:hanging="227"/>
-      </w:pPr>
-      <w:r>
-        <w:rPr>
-          <w:rFonts w:ascii="Kaiti SC" w:hAnsi="Kaiti SC" w:eastAsia="Kaiti SC" w:cs="Kaiti SC"/>
-          <w:sz w:val="21"/>
-        </w:rPr>
-        <w:t xml:space="preserve">➢ </w:t>
-      </w:r>
-      <w:r>
-        <w:rPr>
-          <w:rFonts w:ascii="Kaiti SC" w:hAnsi="Kaiti SC" w:eastAsia="Kaiti SC" w:cs="Kaiti SC"/>
-          <w:sz w:val="21"/>
-        </w:rPr>
-        <w:t>【其他动态】微纳星空：冲刺“民营商业卫星第一股”：微纳星空的“百亿故事”里，藏着一道没解完的题 - 新浪财经 （新浪财经）</w:t>
+        <w:t>【市场与股价】微纳星空：冲刺“民营商业卫星第一股”：微纳星空的“百亿故事”里，藏着一道没解完的题|上海证券交易所|IPO|数据|客户|收入 - 新浪财经 （新浪财经）</w:t>
       </w:r>
     </w:p>
     <w:p>
@@ -669,7 +564,7 @@
                 <w:b w:val="0"/>
                 <w:sz w:val="19"/>
               </w:rPr>
-              <w:t>33</w:t>
+              <w:t>17</w:t>
             </w:r>
           </w:p>
         </w:tc>
@@ -690,7 +585,7 @@
                 <w:b w:val="0"/>
                 <w:sz w:val="19"/>
               </w:rPr>
-              <w:t>发射与任务、监管与政策、其他动态、市场与股价</w:t>
+              <w:t>发射与任务、其他动态、监管与政策</w:t>
             </w:r>
           </w:p>
         </w:tc>
@@ -710,7 +605,7 @@
                 <w:b w:val="0"/>
                 <w:sz w:val="19"/>
               </w:rPr>
-              <w:t>SpaceX eyes 2 rocket launches in 3 days in California after scrubs - Ventura County Star</w:t>
+              <w:t>SpaceX to make another attempt to launch 21 data satellites for Space Development Agency</w:t>
             </w:r>
           </w:p>
         </w:tc>
@@ -756,7 +651,7 @@
                 <w:b w:val="0"/>
                 <w:sz w:val="19"/>
               </w:rPr>
-              <w:t>7</w:t>
+              <w:t>1</w:t>
             </w:r>
           </w:p>
         </w:tc>
@@ -777,7 +672,7 @@
                 <w:b w:val="0"/>
                 <w:sz w:val="19"/>
               </w:rPr>
-              <w:t>市场与股价、发射与任务、产品与技术、其他动态</w:t>
+              <w:t>市场与股价</w:t>
             </w:r>
           </w:p>
         </w:tc>
@@ -797,7 +692,7 @@
                 <w:b w:val="0"/>
                 <w:sz w:val="19"/>
               </w:rPr>
-              <w:t>Blue Origin expands in Texas as its founder contemplates an IPO - SpaceNews</w:t>
+              <w:t>Blue Origin Commits $550M to Texas Satellite Complex as Jeff Bezos Confirms $10B Equity Round and IPO Roadmap</w:t>
             </w:r>
           </w:p>
         </w:tc>
@@ -864,93 +759,6 @@
                 <w:b w:val="0"/>
                 <w:sz w:val="19"/>
               </w:rPr>
-              <w:t>其他动态</w:t>
-            </w:r>
-          </w:p>
-        </w:tc>
-        <w:tc>
-          <w:tcPr>
-            <w:tcW w:type="dxa" w:w="2075"/>
-            <w:vAlign w:val="center"/>
-          </w:tcPr>
-          <w:p>
-            <w:pPr>
-              <w:spacing w:after="0" w:line="252" w:lineRule="auto"/>
-            </w:pPr>
-            <w:r/>
-            <w:r>
-              <w:rPr>
-                <w:rFonts w:ascii="Kaiti SC" w:hAnsi="Kaiti SC" w:eastAsia="Kaiti SC" w:cs="Kaiti SC"/>
-                <w:b w:val="0"/>
-                <w:sz w:val="19"/>
-              </w:rPr>
-              <w:t>冲刺“民营商业卫星第一股”：微纳星空的“百亿故事”里，藏着一道没解完的题 - 新浪财经</w:t>
-            </w:r>
-          </w:p>
-        </w:tc>
-      </w:tr>
-      <w:tr>
-        <w:trPr>
-          <w:cantSplit/>
-        </w:trPr>
-        <w:tc>
-          <w:tcPr>
-            <w:tcW w:type="dxa" w:w="2075"/>
-            <w:vAlign w:val="center"/>
-          </w:tcPr>
-          <w:p>
-            <w:pPr>
-              <w:spacing w:after="0" w:line="252" w:lineRule="auto"/>
-            </w:pPr>
-            <w:r/>
-            <w:r>
-              <w:rPr>
-                <w:rFonts w:ascii="Kaiti SC" w:hAnsi="Kaiti SC" w:eastAsia="Kaiti SC" w:cs="Kaiti SC"/>
-                <w:b w:val="0"/>
-                <w:sz w:val="19"/>
-              </w:rPr>
-              <w:t>银河航天</w:t>
-            </w:r>
-          </w:p>
-        </w:tc>
-        <w:tc>
-          <w:tcPr>
-            <w:tcW w:type="dxa" w:w="2075"/>
-            <w:vAlign w:val="center"/>
-          </w:tcPr>
-          <w:p>
-            <w:pPr>
-              <w:spacing w:after="0" w:line="252" w:lineRule="auto"/>
-              <w:jc w:val="center"/>
-            </w:pPr>
-            <w:r/>
-            <w:r>
-              <w:rPr>
-                <w:rFonts w:ascii="Kaiti SC" w:hAnsi="Kaiti SC" w:eastAsia="Kaiti SC" w:cs="Kaiti SC"/>
-                <w:b w:val="0"/>
-                <w:sz w:val="19"/>
-              </w:rPr>
-              <w:t>1</w:t>
-            </w:r>
-          </w:p>
-        </w:tc>
-        <w:tc>
-          <w:tcPr>
-            <w:tcW w:type="dxa" w:w="2075"/>
-            <w:vAlign w:val="center"/>
-          </w:tcPr>
-          <w:p>
-            <w:pPr>
-              <w:spacing w:after="0" w:line="252" w:lineRule="auto"/>
-              <w:jc w:val="center"/>
-            </w:pPr>
-            <w:r/>
-            <w:r>
-              <w:rPr>
-                <w:rFonts w:ascii="Kaiti SC" w:hAnsi="Kaiti SC" w:eastAsia="Kaiti SC" w:cs="Kaiti SC"/>
-                <w:b w:val="0"/>
-                <w:sz w:val="19"/>
-              </w:rPr>
               <w:t>市场与股价</w:t>
             </w:r>
           </w:p>
@@ -971,7 +779,7 @@
                 <w:b w:val="0"/>
                 <w:sz w:val="19"/>
               </w:rPr>
-              <w:t>银河航天（北京）科技集团股份有限公司启动上市辅导 - Jiemian.com</w:t>
+              <w:t>冲刺“民营商业卫星第一股”：微纳星空的“百亿故事”里，藏着一道没解完的题|上海证券交易所|IPO|数据|客户|收入 - 新浪财经</w:t>
             </w:r>
           </w:p>
         </w:tc>
@@ -1008,7 +816,7 @@
           <w:rFonts w:ascii="Kaiti SC" w:hAnsi="Kaiti SC" w:eastAsia="Kaiti SC" w:cs="Kaiti SC"/>
           <w:sz w:val="21"/>
         </w:rPr>
-        <w:t>[1] 2026-10-09｜SpaceNews｜Blue Origin：Blue Origin expands in Texas as its founder contemplates an IPO - SpaceNews</w:t>
+        <w:t>[1] 2026-10-10｜Spaceflight Now｜SpaceX：SpaceX to make another attempt to launch 21 data satellites for Space Development Agency</w:t>
       </w:r>
     </w:p>
     <w:p>
@@ -1029,7 +837,7 @@
           <w:rFonts w:ascii="Kaiti SC" w:hAnsi="Kaiti SC" w:eastAsia="Kaiti SC" w:cs="Kaiti SC"/>
           <w:sz w:val="21"/>
         </w:rPr>
-        <w:t>[2] 2026-10-09｜AOL.com｜Blue Origin：Blue Origin's potential IPO signals the countdown to a new phase of the space race - AOL.com</w:t>
+        <w:t>[2] 2026-10-10｜satnews.com｜Blue Origin：Blue Origin Commits $550M to Texas Satellite Complex as Jeff Bezos Confirms $10B Equity Round and IPO Roadmap</w:t>
       </w:r>
     </w:p>
     <w:p>
@@ -1050,7 +858,7 @@
           <w:rFonts w:ascii="Kaiti SC" w:hAnsi="Kaiti SC" w:eastAsia="Kaiti SC" w:cs="Kaiti SC"/>
           <w:sz w:val="21"/>
         </w:rPr>
-        <w:t>[3] 2026-10-09｜New York Post｜Blue Origin：Blue Origin IPO could come in next few years, Jeff Bezos says in wake of rocket disaster - New York Post</w:t>
+        <w:t>[3] 2026-10-10｜Spaceflight Now｜SpaceX：SpaceX launches 21 data satellites for the Space Development Agency - Spaceflight Now</w:t>
       </w:r>
     </w:p>
     <w:p>
@@ -1071,7 +879,7 @@
           <w:rFonts w:ascii="Kaiti SC" w:hAnsi="Kaiti SC" w:eastAsia="Kaiti SC" w:cs="Kaiti SC"/>
           <w:sz w:val="21"/>
         </w:rPr>
-        <w:t>[4] 2026-10-09｜Ventura County Star｜SpaceX：SpaceX eyes 2 rocket launches in 3 days in California after scrubs - Ventura County Star</w:t>
+        <w:t>[4] 2026-10-10｜Space｜SpaceX：SpaceX launches 21 satellites to orbit for the US military after 5-day delay (video) - Space</w:t>
       </w:r>
     </w:p>
     <w:p>
@@ -1092,7 +900,7 @@
           <w:rFonts w:ascii="Kaiti SC" w:hAnsi="Kaiti SC" w:eastAsia="Kaiti SC" w:cs="Kaiti SC"/>
           <w:sz w:val="21"/>
         </w:rPr>
-        <w:t>[5] 2026-10-09｜azcentral.com and The Arizona Republic｜SpaceX：SpaceX could be planning near double-header rocket launch in 3 days - azcentral.com and The Arizona Republic</w:t>
+        <w:t>[5] 2026-10-10｜bing.com｜SpaceX：SpaceX 9 deploys 21 satellites for US military in fourth SDA Tranche 1 mission</w:t>
       </w:r>
     </w:p>
     <w:p>
@@ -1113,7 +921,7 @@
           <w:rFonts w:ascii="Kaiti SC" w:hAnsi="Kaiti SC" w:eastAsia="Kaiti SC" w:cs="Kaiti SC"/>
           <w:sz w:val="21"/>
         </w:rPr>
-        <w:t>[6] 2026-10-09｜arstechnica.com｜SpaceX：Rocket Report: A rare Falcon 9 scrub; is it just about Vulcan's time to shine?</w:t>
+        <w:t>[6] 2026-10-10｜bing.com｜SpaceX：SpaceX Falcon 9 launches 21 military satellites into orbit</w:t>
       </w:r>
     </w:p>
     <w:p>
@@ -1134,112 +942,7 @@
           <w:rFonts w:ascii="Kaiti SC" w:hAnsi="Kaiti SC" w:eastAsia="Kaiti SC" w:cs="Kaiti SC"/>
           <w:sz w:val="21"/>
         </w:rPr>
-        <w:t>[7] 2026-10-09｜bing.com｜SpaceX：SpaceX says Starlink will "become a major mobile carrier in the U.S."</w:t>
-      </w:r>
-    </w:p>
-    <w:p>
-      <w:pPr>
-        <w:keepLines/>
-        <w:spacing w:after="60"/>
-        <w:ind w:left="369" w:hanging="227"/>
-      </w:pPr>
-      <w:r>
-        <w:rPr>
-          <w:rFonts w:ascii="Kaiti SC" w:hAnsi="Kaiti SC" w:eastAsia="Kaiti SC" w:cs="Kaiti SC"/>
-          <w:sz w:val="21"/>
-        </w:rPr>
-        <w:t xml:space="preserve">✓ </w:t>
-      </w:r>
-      <w:r>
-        <w:rPr>
-          <w:rFonts w:ascii="Kaiti SC" w:hAnsi="Kaiti SC" w:eastAsia="Kaiti SC" w:cs="Kaiti SC"/>
-          <w:sz w:val="21"/>
-        </w:rPr>
-        <w:t>[8] 2026-10-09｜bing.com｜SpaceX：SpaceX says Starlink will "become a major mobile carrier in the U.S."</w:t>
-      </w:r>
-    </w:p>
-    <w:p>
-      <w:pPr>
-        <w:keepLines/>
-        <w:spacing w:after="60"/>
-        <w:ind w:left="369" w:hanging="227"/>
-      </w:pPr>
-      <w:r>
-        <w:rPr>
-          <w:rFonts w:ascii="Kaiti SC" w:hAnsi="Kaiti SC" w:eastAsia="Kaiti SC" w:cs="Kaiti SC"/>
-          <w:sz w:val="21"/>
-        </w:rPr>
-        <w:t xml:space="preserve">✓ </w:t>
-      </w:r>
-      <w:r>
-        <w:rPr>
-          <w:rFonts w:ascii="Kaiti SC" w:hAnsi="Kaiti SC" w:eastAsia="Kaiti SC" w:cs="Kaiti SC"/>
-          <w:sz w:val="21"/>
-        </w:rPr>
-        <w:t>[9] 2026-10-09｜Advanced Television｜Blue Origin：Blue Origin confirms 2026 launch - Advanced Television</w:t>
-      </w:r>
-    </w:p>
-    <w:p>
-      <w:pPr>
-        <w:keepLines/>
-        <w:spacing w:after="60"/>
-        <w:ind w:left="369" w:hanging="227"/>
-      </w:pPr>
-      <w:r>
-        <w:rPr>
-          <w:rFonts w:ascii="Kaiti SC" w:hAnsi="Kaiti SC" w:eastAsia="Kaiti SC" w:cs="Kaiti SC"/>
-          <w:sz w:val="21"/>
-        </w:rPr>
-        <w:t xml:space="preserve">✓ </w:t>
-      </w:r>
-      <w:r>
-        <w:rPr>
-          <w:rFonts w:ascii="Kaiti SC" w:hAnsi="Kaiti SC" w:eastAsia="Kaiti SC" w:cs="Kaiti SC"/>
-          <w:sz w:val="21"/>
-        </w:rPr>
-        <w:t>[10] 2026-10-09｜bing.com｜Blue Origin：Blue Origin plans $555 million satellite factory in Hutto, Texas</w:t>
-      </w:r>
-    </w:p>
-    <w:p>
-      <w:pPr>
-        <w:keepLines/>
-        <w:spacing w:after="60"/>
-        <w:ind w:left="369" w:hanging="227"/>
-      </w:pPr>
-      <w:r>
-        <w:rPr>
-          <w:rFonts w:ascii="Kaiti SC" w:hAnsi="Kaiti SC" w:eastAsia="Kaiti SC" w:cs="Kaiti SC"/>
-          <w:sz w:val="21"/>
-        </w:rPr>
-        <w:t xml:space="preserve">✓ </w:t>
-      </w:r>
-      <w:r>
-        <w:rPr>
-          <w:rFonts w:ascii="Kaiti SC" w:hAnsi="Kaiti SC" w:eastAsia="Kaiti SC" w:cs="Kaiti SC"/>
-          <w:sz w:val="21"/>
-        </w:rPr>
-        <w:t>[11] 2026-10-09｜Jiemian.com｜银河航天：银河航天（北京）科技集团股份有限公司启动上市辅导 - Jiemian.com</w:t>
-      </w:r>
-    </w:p>
-    <w:p>
-      <w:pPr>
-        <w:keepLines/>
-        <w:spacing w:after="60"/>
-        <w:ind w:left="369" w:hanging="227"/>
-      </w:pPr>
-      <w:r>
-        <w:rPr>
-          <w:rFonts w:ascii="Kaiti SC" w:hAnsi="Kaiti SC" w:eastAsia="Kaiti SC" w:cs="Kaiti SC"/>
-          <w:sz w:val="21"/>
-        </w:rPr>
-        <w:t xml:space="preserve">✓ </w:t>
-      </w:r>
-      <w:r>
-        <w:rPr>
-          <w:rFonts w:ascii="Kaiti SC" w:hAnsi="Kaiti SC" w:eastAsia="Kaiti SC" w:cs="Kaiti SC"/>
-          <w:sz w:val="21"/>
-        </w:rPr>
-        <w:t>[12] 2026-10-09｜新浪财经｜微纳星空：冲刺“民营商业卫星第一股”：微纳星空的“百亿故事”里，藏着一道没解完的题 - 新浪财经</w:t>
+        <w:t>[7] 2026-10-10｜新浪财经｜微纳星空：冲刺“民营商业卫星第一股”：微纳星空的“百亿故事”里，藏着一道没解完的题|上海证券交易所|IPO|数据|客户|收入 - 新浪财经</w:t>
       </w:r>
     </w:p>
     <w:sectPr>

</xml_diff>